<commit_message>
vault backup: 2026-07-09 10:44:16
</commit_message>
<xml_diff>
--- a/Daily-Task-List/Knowledge_Base/WTO-IOTC/基于WTO渔业补贴协定的国际谈判智能体设计思路V6.docx
+++ b/Daily-Task-List/Knowledge_Base/WTO-IOTC/基于WTO渔业补贴协定的国际谈判智能体设计思路V6.docx
@@ -639,13 +639,8 @@
             <w:r>
               <w:t xml:space="preserve"> 119 </w:t>
             </w:r>
-            <w:proofErr w:type="gramStart"/>
-            <w:r>
-              <w:t>个</w:t>
-            </w:r>
-            <w:proofErr w:type="gramEnd"/>
-            <w:r>
-              <w:t>成员批准）</w:t>
+            <w:r>
+              <w:t>个成员批准）</w:t>
             </w:r>
           </w:p>
         </w:tc>
@@ -2501,15 +2496,7 @@
         <w:t>/</w:t>
       </w:r>
       <w:r>
-        <w:t>社会利益。（</w:t>
-      </w:r>
-      <w:proofErr w:type="gramStart"/>
-      <w:r>
-        <w:t>供老师</w:t>
-      </w:r>
-      <w:proofErr w:type="gramEnd"/>
-      <w:r>
-        <w:t>参考验证）。</w:t>
+        <w:t>社会利益。（供老师参考验证）。</w:t>
       </w:r>
       <w:r>
         <w:br/>
@@ -2657,15 +2644,7 @@
         <w:t>渔业规模较大成员</w:t>
       </w:r>
       <w:r>
-        <w:t>：中国、日本、韩国、欧盟、台湾地区（台</w:t>
-      </w:r>
-      <w:proofErr w:type="gramStart"/>
-      <w:r>
-        <w:t>澎</w:t>
-      </w:r>
-      <w:proofErr w:type="gramEnd"/>
-      <w:r>
-        <w:t>金马单独关税区）。诉求：不要立即取消所有补贴。</w:t>
+        <w:t>：中国、日本、韩国、欧盟、台湾地区（台澎金马单独关税区）。诉求：不要立即取消所有补贴。</w:t>
       </w:r>
     </w:p>
     <w:p>
@@ -2991,11 +2970,9 @@
       <w:r>
         <w:t>"</w:t>
       </w:r>
-      <w:proofErr w:type="gramStart"/>
       <w:r>
         <w:t>看利益</w:t>
       </w:r>
-      <w:proofErr w:type="gramEnd"/>
       <w:r>
         <w:t>"</w:t>
       </w:r>
@@ -3277,23 +3254,7 @@
           <w:b/>
           <w:bCs/>
         </w:rPr>
-        <w:t>决策</w:t>
-      </w:r>
-      <w:proofErr w:type="gramStart"/>
-      <w:r>
-        <w:rPr>
-          <w:b/>
-          <w:bCs/>
-        </w:rPr>
-        <w:t>权始终</w:t>
-      </w:r>
-      <w:proofErr w:type="gramEnd"/>
-      <w:r>
-        <w:rPr>
-          <w:b/>
-          <w:bCs/>
-        </w:rPr>
-        <w:t>在学生手里。</w:t>
+        <w:t>决策权始终在学生手里。</w:t>
       </w:r>
     </w:p>
     <w:p>
@@ -3376,7 +3337,7 @@
           <w:sz w:val="20"/>
           <w:szCs w:val="20"/>
         </w:rPr>
-        <w:t xml:space="preserve">    主席宣布会议开始 → 介绍本次会议议题 → 各国举手发表意见 → 形成联盟 → 提出修正案（对议题文本内容增加或者删除，或更改部分表述）→ 再次发表各自意见 → 形成最终文本 → 表决一致通过 → 会议结束    </w:t>
+        <w:t xml:space="preserve">    主席宣布会议开始 → 介绍本次会议议题 → 各国举手发表意见 → 提出修正案（对议题文本内容增加或者删除，或更改部分表述）→ 再次发表各自意见 → 形成最终文本 → 表决一致通过 → 会议结束    </w:t>
       </w:r>
       <w:r>
         <w:br/>
@@ -3663,15 +3624,7 @@
         <w:t>改进建议</w:t>
       </w:r>
       <w:r>
-        <w:t>：如果全部重来，建议先建联盟、再提修正案、最后</w:t>
-      </w:r>
-      <w:proofErr w:type="gramStart"/>
-      <w:r>
-        <w:t>做利益</w:t>
-      </w:r>
-      <w:proofErr w:type="gramEnd"/>
-      <w:r>
-        <w:t>交换。</w:t>
+        <w:t>：如果全部重来，建议先建联盟、再提修正案、最后做利益交换。</w:t>
       </w:r>
     </w:p>
     <w:p>
@@ -3844,13 +3797,8 @@
           </w:tcPr>
           <w:p>
             <w:r>
-              <w:t>是否有效识别并争取盟友、处理</w:t>
-            </w:r>
-            <w:proofErr w:type="gramStart"/>
-            <w:r>
-              <w:t>摇摆国</w:t>
-            </w:r>
-            <w:proofErr w:type="gramEnd"/>
+              <w:t>是否有效识别并争取盟友、处理摇摆国</w:t>
+            </w:r>
           </w:p>
         </w:tc>
       </w:tr>
@@ -4301,21 +4249,12 @@
       <w:r>
         <w:t>自动生成国家画像</w:t>
       </w:r>
-      <w:proofErr w:type="gramStart"/>
-      <w:r>
-        <w:rPr>
-          <w:b/>
-          <w:bCs/>
-        </w:rPr>
-        <w:t>供老师</w:t>
-      </w:r>
-      <w:proofErr w:type="gramEnd"/>
-      <w:r>
-        <w:rPr>
-          <w:b/>
-          <w:bCs/>
-        </w:rPr>
-        <w:t>校对学生准备工作</w:t>
+      <w:r>
+        <w:rPr>
+          <w:b/>
+          <w:bCs/>
+        </w:rPr>
+        <w:t>供老师校对学生准备工作</w:t>
       </w:r>
       <w:r>
         <w:t>；</w:t>
@@ -4498,17 +4437,8 @@
         <w:t>知识导师</w:t>
       </w:r>
       <w:r>
-        <w:t>（阶段</w:t>
-      </w:r>
-      <w:proofErr w:type="gramStart"/>
-      <w:r>
-        <w:t>一</w:t>
-      </w:r>
-      <w:proofErr w:type="gramEnd"/>
-      <w:r>
-        <w:t>，讲解）、</w:t>
-      </w:r>
-      <w:proofErr w:type="gramStart"/>
+        <w:t>（阶段一，讲解）、</w:t>
+      </w:r>
       <w:r>
         <w:rPr>
           <w:b/>
@@ -4516,7 +4446,6 @@
         </w:rPr>
         <w:t>国家智库</w:t>
       </w:r>
-      <w:proofErr w:type="gramEnd"/>
       <w:r>
         <w:rPr>
           <w:b/>
@@ -4821,11 +4750,7 @@
         <w:t xml:space="preserve">AI </w:t>
       </w:r>
       <w:r>
-        <w:t>仅</w:t>
-      </w:r>
-      <w:proofErr w:type="gramStart"/>
-      <w:r>
-        <w:t>作为</w:t>
+        <w:t>仅作为</w:t>
       </w:r>
       <w:r>
         <w:rPr>
@@ -4835,11 +4760,7 @@
         <w:t>智库</w:t>
       </w:r>
       <w:r>
-        <w:t>工具</w:t>
-      </w:r>
-      <w:proofErr w:type="gramEnd"/>
-      <w:r>
-        <w:t>，所有最终决策均由学生自主完成。明确这条边界，教师用起来更放心，也守住了本课</w:t>
+        <w:t>工具，所有最终决策均由学生自主完成。明确这条边界，教师用起来更放心，也守住了本课</w:t>
       </w:r>
       <w:r>
         <w:t>"</w:t>

</xml_diff>